<commit_message>
Regenerar documento de entrega con la evidencia de la Opcion B (PostgreSQL 17)
</commit_message>
<xml_diff>
--- a/docs/entrega/P02_EQUIPO_01.docx
+++ b/docs/entrega/P02_EQUIPO_01.docx
@@ -4293,6 +4293,307 @@
           <w:b w:val="0"/>
           <w:i w:val="0"/>
         </w:rPr>
+        <w:t>También probamos la Opción B del README con el PostgreSQL 17.11 que uno de nosotros tiene instalado en Windows (puerto 5433): creamos el rol y la base con psql, corrimos los mismos scripts de esquema y semilla, cambiamos solo DB_URL en el setenv de Tomcat y la misma aplicación, sin recompilar, quedó conectada. Estas son las líneas clave de esa prueba (el archivo completo es docs/evidencia/txt/19_postgres_nativo_opcionB.txt):</w:t>
+      </w:r>
+    </w:p>
+    <w:tbl>
+      <w:tblPr>
+        <w:tblStyle w:val="TableGrid"/>
+        <w:tblW w:type="auto" w:w="0"/>
+        <w:tblLook w:firstColumn="1" w:firstRow="1" w:lastColumn="0" w:lastRow="0" w:noHBand="0" w:noVBand="1" w:val="04A0"/>
+      </w:tblPr>
+      <w:tblGrid>
+        <w:gridCol w:w="9406"/>
+      </w:tblGrid>
+      <w:tr>
+        <w:tc>
+          <w:tcPr>
+            <w:tcW w:type="dxa" w:w="9406"/>
+            <w:shd w:val="clear" w:color="auto" w:fill="F4F4F2"/>
+          </w:tcPr>
+          <w:p>
+            <w:pPr>
+              <w:spacing w:after="0"/>
+            </w:pPr>
+            <w:r/>
+            <w:r>
+              <w:rPr>
+                <w:rFonts w:ascii="Consolas" w:hAnsi="Consolas" w:eastAsia="Consolas"/>
+                <w:sz w:val="16"/>
+              </w:rPr>
+              <w:t># Opcion B del README: PostgreSQL 17 instalado en Windows (servicio postgresql-x64-17, puerto 5433)</w:t>
+              <w:br/>
+            </w:r>
+            <w:r>
+              <w:rPr>
+                <w:rFonts w:ascii="Consolas" w:hAnsi="Consolas" w:eastAsia="Consolas"/>
+                <w:sz w:val="16"/>
+              </w:rPr>
+              <w:t># Fecha: 2026-09-11T19:33:20-06:00. Comandos ejecutados (sin contrasenas):</w:t>
+              <w:br/>
+            </w:r>
+            <w:r>
+              <w:rPr>
+                <w:rFonts w:ascii="Consolas" w:hAnsi="Consolas" w:eastAsia="Consolas"/>
+                <w:sz w:val="16"/>
+              </w:rPr>
+              <w:t>#   psql -U postgres -p 5433 -c "CREATE ROLE huerto_app LOGIN PASSWORD '...'"</w:t>
+              <w:br/>
+            </w:r>
+            <w:r>
+              <w:rPr>
+                <w:rFonts w:ascii="Consolas" w:hAnsi="Consolas" w:eastAsia="Consolas"/>
+                <w:sz w:val="16"/>
+              </w:rPr>
+              <w:t>#   psql -U postgres -p 5433 -c "CREATE DATABASE huerto_db OWNER huerto_app"</w:t>
+              <w:br/>
+            </w:r>
+            <w:r>
+              <w:rPr>
+                <w:rFonts w:ascii="Consolas" w:hAnsi="Consolas" w:eastAsia="Consolas"/>
+                <w:sz w:val="16"/>
+              </w:rPr>
+              <w:t>#   psql -U huerto_app -p 5433 -d huerto_db -f sql/01_schema.sql</w:t>
+              <w:br/>
+            </w:r>
+            <w:r>
+              <w:rPr>
+                <w:rFonts w:ascii="Consolas" w:hAnsi="Consolas" w:eastAsia="Consolas"/>
+                <w:sz w:val="16"/>
+              </w:rPr>
+              <w:t>#   psql -U huerto_app -p 5433 -d huerto_db -f sql/02_seed.sql</w:t>
+              <w:br/>
+            </w:r>
+            <w:r>
+              <w:rPr>
+                <w:rFonts w:ascii="Consolas" w:hAnsi="Consolas" w:eastAsia="Consolas"/>
+                <w:sz w:val="16"/>
+              </w:rPr>
+              <w:t>#   psql -U huerto_app -p 5433 -d huerto_db -f sql/03_consultas_verificacion.sql</w:t>
+              <w:br/>
+            </w:r>
+            <w:r>
+              <w:rPr>
+                <w:rFonts w:ascii="Consolas" w:hAnsi="Consolas" w:eastAsia="Consolas"/>
+                <w:sz w:val="16"/>
+              </w:rPr>
+              <w:t xml:space="preserve"> PostgreSQL 17.11 on x86_64-windows, compiled by msvc-19.44.35228, 64-bit</w:t>
+              <w:br/>
+            </w:r>
+            <w:r>
+              <w:rPr>
+                <w:rFonts w:ascii="Consolas" w:hAnsi="Consolas" w:eastAsia="Consolas"/>
+                <w:sz w:val="16"/>
+              </w:rPr>
+              <w:t xml:space="preserve"> id |    codigo     |       variable       |  zona  | valor | unidad |  origen  |          observacion          |         registrado_en         | alerta</w:t>
+              <w:br/>
+            </w:r>
+            <w:r>
+              <w:rPr>
+                <w:rFonts w:ascii="Consolas" w:hAnsi="Consolas" w:eastAsia="Consolas"/>
+                <w:sz w:val="16"/>
+              </w:rPr>
+              <w:t>----+---------------+----------------------+--------+-------+--------+----------+-------------------------------+-------------------------------+--------</w:t>
+              <w:br/>
+            </w:r>
+            <w:r>
+              <w:rPr>
+                <w:rFonts w:ascii="Consolas" w:hAnsi="Consolas" w:eastAsia="Consolas"/>
+                <w:sz w:val="16"/>
+              </w:rPr>
+              <w:t xml:space="preserve">  1 | SEN-A-TEMP-01 | Temperatura ambiente | Cama A | 24.50 | C      | simulado | Carga inicial del laboratorio | 2026-09-11 19:33:20.102458-06 |</w:t>
+              <w:br/>
+            </w:r>
+            <w:r>
+              <w:rPr>
+                <w:rFonts w:ascii="Consolas" w:hAnsi="Consolas" w:eastAsia="Consolas"/>
+                <w:sz w:val="16"/>
+              </w:rPr>
+              <w:t xml:space="preserve">  2 | SEN-A-HSUE-01 | Humedad de suelo     | Cama A | 55.00 | %      | simulado | Carga inicial del laboratorio | 2026-09-11 19:33:20.102458-06 |</w:t>
+              <w:br/>
+            </w:r>
+            <w:r>
+              <w:rPr>
+                <w:rFonts w:ascii="Consolas" w:hAnsi="Consolas" w:eastAsia="Consolas"/>
+                <w:sz w:val="16"/>
+              </w:rPr>
+              <w:t xml:space="preserve"> id | codigo | nivel | mensaje | atendida | creada_en</w:t>
+              <w:br/>
+            </w:r>
+            <w:r>
+              <w:rPr>
+                <w:rFonts w:ascii="Consolas" w:hAnsi="Consolas" w:eastAsia="Consolas"/>
+                <w:sz w:val="16"/>
+              </w:rPr>
+              <w:t>----+--------+-------+---------+----------+-----------</w:t>
+              <w:br/>
+            </w:r>
+            <w:r>
+              <w:rPr>
+                <w:rFonts w:ascii="Consolas" w:hAnsi="Consolas" w:eastAsia="Consolas"/>
+                <w:sz w:val="16"/>
+              </w:rPr>
+              <w:t xml:space="preserve"> id |  zona  |  autor_rol  |                                texto                                 | lectura_id |           creada_en</w:t>
+              <w:br/>
+            </w:r>
+            <w:r>
+              <w:rPr>
+                <w:rFonts w:ascii="Consolas" w:hAnsi="Consolas" w:eastAsia="Consolas"/>
+                <w:sz w:val="16"/>
+              </w:rPr>
+              <w:t>----+--------+-------------+----------------------------------------------------------------------+------------+-------------------------------</w:t>
+              <w:br/>
+            </w:r>
+            <w:r>
+              <w:rPr>
+                <w:rFonts w:ascii="Consolas" w:hAnsi="Consolas" w:eastAsia="Consolas"/>
+                <w:sz w:val="16"/>
+              </w:rPr>
+              <w:t xml:space="preserve">  1 | Cama A | RESPONSABLE | Sensores instalados y calibrados con datos ficticios de laboratorio. |            | 2026-09-11 19:33:20.102458-06</w:t>
+              <w:br/>
+            </w:r>
+            <w:r>
+              <w:rPr>
+                <w:rFonts w:ascii="Consolas" w:hAnsi="Consolas" w:eastAsia="Consolas"/>
+                <w:sz w:val="16"/>
+              </w:rPr>
+              <w:t># --- La aplicacion web1 conectada al PostgreSQL 17 nativo (DB_URL=jdbc:postgresql://localhost:5433/huerto_db) ---</w:t>
+              <w:br/>
+            </w:r>
+            <w:r>
+              <w:rPr>
+                <w:rFonts w:ascii="Consolas" w:hAnsi="Consolas" w:eastAsia="Consolas"/>
+                <w:sz w:val="16"/>
+              </w:rPr>
+              <w:t>$ curl -s http://localhost:8080/web1/health</w:t>
+              <w:br/>
+            </w:r>
+            <w:r>
+              <w:rPr>
+                <w:rFonts w:ascii="Consolas" w:hAnsi="Consolas" w:eastAsia="Consolas"/>
+                <w:sz w:val="16"/>
+              </w:rPr>
+              <w:t>{"status":"UP","app":"web1 PR09 monitoreo de huerto","db":"UP","dbUrl":"jdbc:postgresql://localhost:5433/huerto_db","postgres":"PostgreSQL 17.11 on x86_64-windows, compiled by msvc-19.44.35228, 64-bit","lecturas":2}</w:t>
+              <w:br/>
+            </w:r>
+            <w:r>
+              <w:rPr>
+                <w:rFonts w:ascii="Consolas" w:hAnsi="Consolas" w:eastAsia="Consolas"/>
+                <w:sz w:val="16"/>
+              </w:rPr>
+              <w:t>$ curl -i -X POST -d "sensorId=2&amp;valor=29.5&amp;observacion=Opcion+B+PostgreSQL+17+nativo" http://localhost:8080/web1/lecturas</w:t>
+              <w:br/>
+            </w:r>
+            <w:r>
+              <w:rPr>
+                <w:rFonts w:ascii="Consolas" w:hAnsi="Consolas" w:eastAsia="Consolas"/>
+                <w:sz w:val="16"/>
+              </w:rPr>
+              <w:t>HTTP/1.1 303</w:t>
+              <w:br/>
+            </w:r>
+            <w:r>
+              <w:rPr>
+                <w:rFonts w:ascii="Consolas" w:hAnsi="Consolas" w:eastAsia="Consolas"/>
+                <w:sz w:val="16"/>
+              </w:rPr>
+              <w:t>Location: /web1/lecturas?creada=3</w:t>
+              <w:br/>
+            </w:r>
+            <w:r>
+              <w:rPr>
+                <w:rFonts w:ascii="Consolas" w:hAnsi="Consolas" w:eastAsia="Consolas"/>
+                <w:sz w:val="16"/>
+              </w:rPr>
+              <w:t>$ curl -i -X POST -d "sensorId=2&amp;valor=abc" http://localhost:8080/web1/lecturas   (negativa)</w:t>
+              <w:br/>
+            </w:r>
+            <w:r>
+              <w:rPr>
+                <w:rFonts w:ascii="Consolas" w:hAnsi="Consolas" w:eastAsia="Consolas"/>
+                <w:sz w:val="16"/>
+              </w:rPr>
+              <w:t>HTTP/1.1 400</w:t>
+              <w:br/>
+            </w:r>
+            <w:r>
+              <w:rPr>
+                <w:rFonts w:ascii="Consolas" w:hAnsi="Consolas" w:eastAsia="Consolas"/>
+                <w:sz w:val="16"/>
+              </w:rPr>
+              <w:t xml:space="preserve">          &lt;li&gt;El valor debe ser numerico (ejemplo: 24.5).&lt;/li&gt;</w:t>
+              <w:br/>
+            </w:r>
+            <w:r>
+              <w:rPr>
+                <w:rFonts w:ascii="Consolas" w:hAnsi="Consolas" w:eastAsia="Consolas"/>
+                <w:sz w:val="16"/>
+              </w:rPr>
+              <w:t>$ psql -U huerto_app -p 5433 -d huerto_db -c "SELECT id, valor, origen, observacion, registrado_en FROM lectura ORDER BY id DESC LIMIT 3"</w:t>
+              <w:br/>
+            </w:r>
+            <w:r>
+              <w:rPr>
+                <w:rFonts w:ascii="Consolas" w:hAnsi="Consolas" w:eastAsia="Consolas"/>
+                <w:sz w:val="16"/>
+              </w:rPr>
+              <w:t xml:space="preserve"> id | valor |  origen  |          observacion          |         registrado_en</w:t>
+              <w:br/>
+            </w:r>
+            <w:r>
+              <w:rPr>
+                <w:rFonts w:ascii="Consolas" w:hAnsi="Consolas" w:eastAsia="Consolas"/>
+                <w:sz w:val="16"/>
+              </w:rPr>
+              <w:t>----+-------+----------+-------------------------------+-------------------------------</w:t>
+              <w:br/>
+            </w:r>
+            <w:r>
+              <w:rPr>
+                <w:rFonts w:ascii="Consolas" w:hAnsi="Consolas" w:eastAsia="Consolas"/>
+                <w:sz w:val="16"/>
+              </w:rPr>
+              <w:t xml:space="preserve">  3 | 29.50 | manual   | Opcion B PostgreSQL 17 nativo | 2026-09-11 19:42:13.42885-06</w:t>
+              <w:br/>
+            </w:r>
+            <w:r>
+              <w:rPr>
+                <w:rFonts w:ascii="Consolas" w:hAnsi="Consolas" w:eastAsia="Consolas"/>
+                <w:sz w:val="16"/>
+              </w:rPr>
+              <w:t xml:space="preserve">  2 | 55.00 | simulado | Carga inicial del laboratorio | 2026-09-11 19:33:20.102458-06</w:t>
+              <w:br/>
+            </w:r>
+            <w:r>
+              <w:rPr>
+                <w:rFonts w:ascii="Consolas" w:hAnsi="Consolas" w:eastAsia="Consolas"/>
+                <w:sz w:val="16"/>
+              </w:rPr>
+              <w:t xml:space="preserve">  1 | 24.50 | simulado | Carga inicial del laboratorio | 2026-09-11 19:33:20.102458-06</w:t>
+              <w:br/>
+            </w:r>
+            <w:r>
+              <w:rPr>
+                <w:rFonts w:ascii="Consolas" w:hAnsi="Consolas" w:eastAsia="Consolas"/>
+                <w:sz w:val="16"/>
+              </w:rPr>
+              <w:t>(3 filas)</w:t>
+            </w:r>
+          </w:p>
+        </w:tc>
+      </w:tr>
+    </w:tbl>
+    <w:p>
+      <w:pPr>
+        <w:spacing w:after="40"/>
+      </w:pPr>
+    </w:p>
+    <w:p>
+      <w:r>
+        <w:rPr>
+          <w:b w:val="0"/>
+          <w:i w:val="0"/>
+        </w:rPr>
         <w:t>Como prueba negativa de infraestructura detuvimos el contenedor de PostgreSQL con la aplicación corriendo: /health pasó a 503 y /lecturas mostró la página de error controlada, sin trazas ni credenciales. Al volver a arrancar la base, la aplicación se recuperó sola sin reiniciar Tomcat.</w:t>
       </w:r>
     </w:p>

</xml_diff>

<commit_message>
Capturas reales de psql (PostgreSQL 16 Docker y PostgreSQL 17 instalado) en la evidencia y el documento
- scripts/capturas_psql.ps1: abre Windows Terminal con psql y captura solo esa ventana
- img/14, 15, 16 y 17: tablas y conteos, lecturas/alertas/anotaciones, estructura, Opcion B
- Documento de entrega e indice R02 actualizados
</commit_message>
<xml_diff>
--- a/docs/entrega/P02_EQUIPO_01.docx
+++ b/docs/entrega/P02_EQUIPO_01.docx
@@ -4208,6 +4208,177 @@
           <w:b w:val="0"/>
           <w:i w:val="0"/>
         </w:rPr>
+        <w:t>Del lado de la base de datos, estas son capturas de sesiones psql contra el PostgreSQL 16 del contenedor (puerto 5436) tomadas después de las capturas de la aplicación. En la primera se ve la conexión, las siete tablas con su dueño y los conteos; en la segunda, la estructura de lectura y anotación con sus llaves, restricciones CHECK e índices; en la tercera, las lecturas con su procedencia, la alerta y las anotaciones, que coinciden con las figuras anteriores.</w:t>
+      </w:r>
+    </w:p>
+    <w:p>
+      <w:pPr>
+        <w:spacing w:after="40"/>
+        <w:jc w:val="center"/>
+      </w:pPr>
+      <w:r>
+        <w:drawing>
+          <wp:inline xmlns:a="http://schemas.openxmlformats.org/drawingml/2006/main" xmlns:pic="http://schemas.openxmlformats.org/drawingml/2006/picture">
+            <wp:extent cx="5940000" cy="3769462"/>
+            <wp:docPr id="13" name="Picture 13"/>
+            <wp:cNvGraphicFramePr>
+              <a:graphicFrameLocks noChangeAspect="1"/>
+            </wp:cNvGraphicFramePr>
+            <a:graphic>
+              <a:graphicData uri="http://schemas.openxmlformats.org/drawingml/2006/picture">
+                <pic:pic>
+                  <pic:nvPicPr>
+                    <pic:cNvPr id="0" name="14_psql_docker_tablas.png"/>
+                    <pic:cNvPicPr/>
+                  </pic:nvPicPr>
+                  <pic:blipFill>
+                    <a:blip r:embed="rId23"/>
+                    <a:stretch>
+                      <a:fillRect/>
+                    </a:stretch>
+                  </pic:blipFill>
+                  <pic:spPr>
+                    <a:xfrm>
+                      <a:off x="0" y="0"/>
+                      <a:ext cx="5940000" cy="3769462"/>
+                    </a:xfrm>
+                    <a:prstGeom prst="rect"/>
+                  </pic:spPr>
+                </pic:pic>
+              </a:graphicData>
+            </a:graphic>
+          </wp:inline>
+        </w:drawing>
+      </w:r>
+    </w:p>
+    <w:p>
+      <w:pPr>
+        <w:spacing w:after="200"/>
+        <w:jc w:val="center"/>
+      </w:pPr>
+      <w:r>
+        <w:rPr>
+          <w:i/>
+          <w:color w:val="555555"/>
+          <w:sz w:val="19"/>
+        </w:rPr>
+        <w:t>Figura 13. psql en PostgreSQL 16 (Docker): conexión, tablas y conteos por entidad.</w:t>
+      </w:r>
+    </w:p>
+    <w:p>
+      <w:pPr>
+        <w:spacing w:after="40"/>
+        <w:jc w:val="center"/>
+      </w:pPr>
+      <w:r>
+        <w:drawing>
+          <wp:inline xmlns:a="http://schemas.openxmlformats.org/drawingml/2006/main" xmlns:pic="http://schemas.openxmlformats.org/drawingml/2006/picture">
+            <wp:extent cx="5940000" cy="4568923"/>
+            <wp:docPr id="14" name="Picture 14"/>
+            <wp:cNvGraphicFramePr>
+              <a:graphicFrameLocks noChangeAspect="1"/>
+            </wp:cNvGraphicFramePr>
+            <a:graphic>
+              <a:graphicData uri="http://schemas.openxmlformats.org/drawingml/2006/picture">
+                <pic:pic>
+                  <pic:nvPicPr>
+                    <pic:cNvPr id="0" name="17_psql_docker_estructura.png"/>
+                    <pic:cNvPicPr/>
+                  </pic:nvPicPr>
+                  <pic:blipFill>
+                    <a:blip r:embed="rId24"/>
+                    <a:stretch>
+                      <a:fillRect/>
+                    </a:stretch>
+                  </pic:blipFill>
+                  <pic:spPr>
+                    <a:xfrm>
+                      <a:off x="0" y="0"/>
+                      <a:ext cx="5940000" cy="4568923"/>
+                    </a:xfrm>
+                    <a:prstGeom prst="rect"/>
+                  </pic:spPr>
+                </pic:pic>
+              </a:graphicData>
+            </a:graphic>
+          </wp:inline>
+        </w:drawing>
+      </w:r>
+    </w:p>
+    <w:p>
+      <w:pPr>
+        <w:spacing w:after="200"/>
+        <w:jc w:val="center"/>
+      </w:pPr>
+      <w:r>
+        <w:rPr>
+          <w:i/>
+          <w:color w:val="555555"/>
+          <w:sz w:val="19"/>
+        </w:rPr>
+        <w:t>Figura 14. psql: estructura de las tablas lectura y anotación (llaves foráneas, CHECK e índices).</w:t>
+      </w:r>
+    </w:p>
+    <w:p>
+      <w:pPr>
+        <w:spacing w:after="40"/>
+        <w:jc w:val="center"/>
+      </w:pPr>
+      <w:r>
+        <w:drawing>
+          <wp:inline xmlns:a="http://schemas.openxmlformats.org/drawingml/2006/main" xmlns:pic="http://schemas.openxmlformats.org/drawingml/2006/picture">
+            <wp:extent cx="5940000" cy="3769462"/>
+            <wp:docPr id="15" name="Picture 15"/>
+            <wp:cNvGraphicFramePr>
+              <a:graphicFrameLocks noChangeAspect="1"/>
+            </wp:cNvGraphicFramePr>
+            <a:graphic>
+              <a:graphicData uri="http://schemas.openxmlformats.org/drawingml/2006/picture">
+                <pic:pic>
+                  <pic:nvPicPr>
+                    <pic:cNvPr id="0" name="15_psql_docker_lecturas.png"/>
+                    <pic:cNvPicPr/>
+                  </pic:nvPicPr>
+                  <pic:blipFill>
+                    <a:blip r:embed="rId25"/>
+                    <a:stretch>
+                      <a:fillRect/>
+                    </a:stretch>
+                  </pic:blipFill>
+                  <pic:spPr>
+                    <a:xfrm>
+                      <a:off x="0" y="0"/>
+                      <a:ext cx="5940000" cy="3769462"/>
+                    </a:xfrm>
+                    <a:prstGeom prst="rect"/>
+                  </pic:spPr>
+                </pic:pic>
+              </a:graphicData>
+            </a:graphic>
+          </wp:inline>
+        </w:drawing>
+      </w:r>
+    </w:p>
+    <w:p>
+      <w:pPr>
+        <w:spacing w:after="200"/>
+        <w:jc w:val="center"/>
+      </w:pPr>
+      <w:r>
+        <w:rPr>
+          <w:i/>
+          <w:color w:val="555555"/>
+          <w:sz w:val="19"/>
+        </w:rPr>
+        <w:t>Figura 15. psql: lecturas con procedencia y alerta, alertas y anotaciones registradas.</w:t>
+      </w:r>
+    </w:p>
+    <w:p>
+      <w:r>
+        <w:rPr>
+          <w:b w:val="0"/>
+          <w:i w:val="0"/>
+        </w:rPr>
         <w:t>Estas son las líneas del log de Tomcat en las que se ve el despliegue del WAR (las rutas locales se sustituyeron por marcadores para no incluir rutas privadas):</w:t>
       </w:r>
     </w:p>
@@ -4587,6 +4758,60 @@
       <w:pPr>
         <w:spacing w:after="40"/>
       </w:pPr>
+    </w:p>
+    <w:p>
+      <w:pPr>
+        <w:spacing w:after="40"/>
+        <w:jc w:val="center"/>
+      </w:pPr>
+      <w:r>
+        <w:drawing>
+          <wp:inline xmlns:a="http://schemas.openxmlformats.org/drawingml/2006/main" xmlns:pic="http://schemas.openxmlformats.org/drawingml/2006/picture">
+            <wp:extent cx="5940000" cy="3769462"/>
+            <wp:docPr id="16" name="Picture 16"/>
+            <wp:cNvGraphicFramePr>
+              <a:graphicFrameLocks noChangeAspect="1"/>
+            </wp:cNvGraphicFramePr>
+            <a:graphic>
+              <a:graphicData uri="http://schemas.openxmlformats.org/drawingml/2006/picture">
+                <pic:pic>
+                  <pic:nvPicPr>
+                    <pic:cNvPr id="0" name="16_psql_nativo_pg17.png"/>
+                    <pic:cNvPicPr/>
+                  </pic:nvPicPr>
+                  <pic:blipFill>
+                    <a:blip r:embed="rId26"/>
+                    <a:stretch>
+                      <a:fillRect/>
+                    </a:stretch>
+                  </pic:blipFill>
+                  <pic:spPr>
+                    <a:xfrm>
+                      <a:off x="0" y="0"/>
+                      <a:ext cx="5940000" cy="3769462"/>
+                    </a:xfrm>
+                    <a:prstGeom prst="rect"/>
+                  </pic:spPr>
+                </pic:pic>
+              </a:graphicData>
+            </a:graphic>
+          </wp:inline>
+        </w:drawing>
+      </w:r>
+    </w:p>
+    <w:p>
+      <w:pPr>
+        <w:spacing w:after="200"/>
+        <w:jc w:val="center"/>
+      </w:pPr>
+      <w:r>
+        <w:rPr>
+          <w:i/>
+          <w:color w:val="555555"/>
+          <w:sz w:val="19"/>
+        </w:rPr>
+        <w:t>Figura 16. psql en el PostgreSQL 17 instalado en Windows (puerto 5433): las mismas siete tablas y la lectura registrada desde la aplicación.</w:t>
+      </w:r>
     </w:p>
     <w:p>
       <w:r>

</xml_diff>